<commit_message>
docs: add dialectics article archive
Co-authored-by: 36613453226Wallen <36613453226Wallen@users.noreply.github.com>
</commit_message>
<xml_diff>
--- a/files/YaoZHIhu/姚勇文章目录/姚勇文章目录.docx
+++ b/files/YaoZHIhu/姚勇文章目录/姚勇文章目录.docx
@@ -29,7 +29,7 @@
           <w:color w:val="5F6368"/>
           <w:sz w:val="16"/>
         </w:rPr>
-        <w:t>登记 2 篇｜已生成 1 篇｜更新 2026-09-06 14:15 UTC｜口令：“收录姚勇文章”</w:t>
+        <w:t>登记 2 篇｜已生成 2 篇｜更新 2026-09-06 14:20 UTC｜口令：“收录姚勇文章”</w:t>
       </w:r>
     </w:p>
     <w:tbl>
@@ -296,7 +296,7 @@
               </w:rPr>
               <w:t>发布：未知</w:t>
               <w:br/>
-              <w:t>编辑：未知</w:t>
+              <w:t>编辑：2025-12-08 10:12（截图页面）</w:t>
             </w:r>
           </w:p>
         </w:tc>
@@ -317,7 +317,7 @@
                 <w:b w:val="0"/>
                 <w:sz w:val="17"/>
               </w:rPr>
-              <w:t>待PDF｜DOCX尚未生成</w:t>
+              <w:t>约3,594字｜16个标题｜156段｜已生成</w:t>
             </w:r>
           </w:p>
           <w:p>

</xml_diff>

<commit_message>
docs: clarify dialectics article title
Co-authored-by: 36613453226Wallen <36613453226Wallen@users.noreply.github.com>
</commit_message>
<xml_diff>
--- a/files/YaoZHIhu/姚勇文章目录/姚勇文章目录.docx
+++ b/files/YaoZHIhu/姚勇文章目录/姚勇文章目录.docx
@@ -29,7 +29,7 @@
           <w:color w:val="5F6368"/>
           <w:sz w:val="16"/>
         </w:rPr>
-        <w:t>登记 2 篇｜已生成 2 篇｜更新 2026-09-06 14:20 UTC｜口令：“收录姚勇文章”</w:t>
+        <w:t>登记 2 篇｜已生成 2 篇｜更新 2026-09-06 14:32 UTC｜口令：“收录姚勇文章”</w:t>
       </w:r>
     </w:p>
     <w:tbl>
@@ -273,7 +273,7 @@
                 <w:b w:val="0"/>
                 <w:sz w:val="17"/>
               </w:rPr>
-              <w:t>2辩证法.docx</w:t>
+              <w:t>2辩证法解释一切与废话？从联系、矛盾到实践.docx</w:t>
             </w:r>
           </w:p>
         </w:tc>
@@ -317,7 +317,7 @@
                 <w:b w:val="0"/>
                 <w:sz w:val="17"/>
               </w:rPr>
-              <w:t>约3,594字｜16个标题｜156段｜已生成</w:t>
+              <w:t>约3,609字｜16个标题｜156段｜已生成</w:t>
             </w:r>
           </w:p>
           <w:p>

</xml_diff>

<commit_message>
docs: archive Yao Yong competition article
Co-authored-by: 36613453226Wallen <36613453226Wallen@users.noreply.github.com>
</commit_message>
<xml_diff>
--- a/files/YaoZHIhu/姚勇文章目录/姚勇文章目录.docx
+++ b/files/YaoZHIhu/姚勇文章目录/姚勇文章目录.docx
@@ -29,7 +29,7 @@
           <w:color w:val="5F6368"/>
           <w:sz w:val="16"/>
         </w:rPr>
-        <w:t>登记 2 篇｜已生成 2 篇｜更新 2026-09-06 14:32 UTC｜口令：“收录姚勇文章”</w:t>
+        <w:t>登记 3 篇｜已生成 3 篇｜更新 2026-09-06 17:03 UTC｜口令：“收录姚勇文章”</w:t>
       </w:r>
     </w:p>
     <w:tbl>
@@ -332,6 +332,104 @@
                 <w:sz w:val="15"/>
               </w:rPr>
               <w:t>原文：https://www.zhihu.com/question/1980013147407545849/answer/1981201398533226606</w:t>
+            </w:r>
+          </w:p>
+        </w:tc>
+      </w:tr>
+      <w:tr>
+        <w:tc>
+          <w:tcPr>
+            <w:tcW w:type="dxa" w:w="792"/>
+            <w:vAlign w:val="center"/>
+          </w:tcPr>
+          <w:p>
+            <w:pPr>
+              <w:spacing w:before="0" w:after="0" w:line="240" w:lineRule="auto"/>
+              <w:jc w:val="center"/>
+            </w:pPr>
+            <w:r>
+              <w:rPr>
+                <w:rFonts w:ascii="宋体" w:hAnsi="宋体" w:eastAsia="宋体"/>
+                <w:b w:val="0"/>
+                <w:sz w:val="17"/>
+              </w:rPr>
+              <w:t>3</w:t>
+            </w:r>
+          </w:p>
+        </w:tc>
+        <w:tc>
+          <w:tcPr>
+            <w:tcW w:type="dxa" w:w="3960"/>
+            <w:vAlign w:val="center"/>
+          </w:tcPr>
+          <w:p>
+            <w:pPr>
+              <w:spacing w:before="0" w:after="0" w:line="240" w:lineRule="auto"/>
+              <w:jc w:val="left"/>
+            </w:pPr>
+            <w:r>
+              <w:rPr>
+                <w:rFonts w:ascii="宋体" w:hAnsi="宋体" w:eastAsia="宋体"/>
+                <w:b w:val="0"/>
+                <w:sz w:val="17"/>
+              </w:rPr>
+              <w:t>3你在和谁比？竞争力、资源与长期投入.docx</w:t>
+            </w:r>
+          </w:p>
+        </w:tc>
+        <w:tc>
+          <w:tcPr>
+            <w:tcW w:type="dxa" w:w="2376"/>
+            <w:vAlign w:val="center"/>
+          </w:tcPr>
+          <w:p>
+            <w:pPr>
+              <w:spacing w:before="0" w:after="0" w:line="240" w:lineRule="auto"/>
+              <w:jc w:val="left"/>
+            </w:pPr>
+            <w:r>
+              <w:rPr>
+                <w:rFonts w:ascii="宋体" w:hAnsi="宋体" w:eastAsia="宋体"/>
+                <w:b w:val="0"/>
+                <w:sz w:val="17"/>
+              </w:rPr>
+              <w:t>发布：未知</w:t>
+              <w:br/>
+              <w:t>编辑：2025-11-12 21:32（截图页面）</w:t>
+            </w:r>
+          </w:p>
+        </w:tc>
+        <w:tc>
+          <w:tcPr>
+            <w:tcW w:type="dxa" w:w="3528"/>
+            <w:vAlign w:val="center"/>
+          </w:tcPr>
+          <w:p>
+            <w:pPr>
+              <w:spacing w:before="0" w:after="0" w:line="240" w:lineRule="auto"/>
+              <w:jc w:val="left"/>
+            </w:pPr>
+            <w:r>
+              <w:rPr>
+                <w:rFonts w:ascii="宋体" w:hAnsi="宋体" w:eastAsia="宋体"/>
+                <w:b w:val="0"/>
+                <w:sz w:val="17"/>
+              </w:rPr>
+              <w:t>约712字｜0个标题｜18段｜已生成</w:t>
+            </w:r>
+          </w:p>
+          <w:p>
+            <w:pPr>
+              <w:spacing w:before="0" w:after="0" w:line="240" w:lineRule="auto"/>
+            </w:pPr>
+            <w:r>
+              <w:rPr>
+                <w:rFonts w:ascii="宋体" w:hAnsi="宋体" w:eastAsia="宋体"/>
+                <w:b w:val="0"/>
+                <w:color w:val="2E74B5"/>
+                <w:sz w:val="15"/>
+              </w:rPr>
+              <w:t>原文：https://www.zhihu.com/people/H3D/search?keyword=K12&amp;pathBefore=%2Fpeople%2FH3D</w:t>
             </w:r>
           </w:p>
         </w:tc>

</xml_diff>

<commit_message>
docs: archive Yao Yong competition article (#8)
Co-authored-by: Cursor Agent <cursoragent@cursor.com>
Co-authored-by: 36613453226Wallen <36613453226Wallen@users.noreply.github.com>
</commit_message>
<xml_diff>
--- a/files/YaoZHIhu/姚勇文章目录/姚勇文章目录.docx
+++ b/files/YaoZHIhu/姚勇文章目录/姚勇文章目录.docx
@@ -29,7 +29,7 @@
           <w:color w:val="5F6368"/>
           <w:sz w:val="16"/>
         </w:rPr>
-        <w:t>登记 2 篇｜已生成 2 篇｜更新 2026-09-06 14:32 UTC｜口令：“收录姚勇文章”</w:t>
+        <w:t>登记 3 篇｜已生成 3 篇｜更新 2026-09-06 17:03 UTC｜口令：“收录姚勇文章”</w:t>
       </w:r>
     </w:p>
     <w:tbl>
@@ -332,6 +332,104 @@
                 <w:sz w:val="15"/>
               </w:rPr>
               <w:t>原文：https://www.zhihu.com/question/1980013147407545849/answer/1981201398533226606</w:t>
+            </w:r>
+          </w:p>
+        </w:tc>
+      </w:tr>
+      <w:tr>
+        <w:tc>
+          <w:tcPr>
+            <w:tcW w:type="dxa" w:w="792"/>
+            <w:vAlign w:val="center"/>
+          </w:tcPr>
+          <w:p>
+            <w:pPr>
+              <w:spacing w:before="0" w:after="0" w:line="240" w:lineRule="auto"/>
+              <w:jc w:val="center"/>
+            </w:pPr>
+            <w:r>
+              <w:rPr>
+                <w:rFonts w:ascii="宋体" w:hAnsi="宋体" w:eastAsia="宋体"/>
+                <w:b w:val="0"/>
+                <w:sz w:val="17"/>
+              </w:rPr>
+              <w:t>3</w:t>
+            </w:r>
+          </w:p>
+        </w:tc>
+        <w:tc>
+          <w:tcPr>
+            <w:tcW w:type="dxa" w:w="3960"/>
+            <w:vAlign w:val="center"/>
+          </w:tcPr>
+          <w:p>
+            <w:pPr>
+              <w:spacing w:before="0" w:after="0" w:line="240" w:lineRule="auto"/>
+              <w:jc w:val="left"/>
+            </w:pPr>
+            <w:r>
+              <w:rPr>
+                <w:rFonts w:ascii="宋体" w:hAnsi="宋体" w:eastAsia="宋体"/>
+                <w:b w:val="0"/>
+                <w:sz w:val="17"/>
+              </w:rPr>
+              <w:t>3你在和谁比？竞争力、资源与长期投入.docx</w:t>
+            </w:r>
+          </w:p>
+        </w:tc>
+        <w:tc>
+          <w:tcPr>
+            <w:tcW w:type="dxa" w:w="2376"/>
+            <w:vAlign w:val="center"/>
+          </w:tcPr>
+          <w:p>
+            <w:pPr>
+              <w:spacing w:before="0" w:after="0" w:line="240" w:lineRule="auto"/>
+              <w:jc w:val="left"/>
+            </w:pPr>
+            <w:r>
+              <w:rPr>
+                <w:rFonts w:ascii="宋体" w:hAnsi="宋体" w:eastAsia="宋体"/>
+                <w:b w:val="0"/>
+                <w:sz w:val="17"/>
+              </w:rPr>
+              <w:t>发布：未知</w:t>
+              <w:br/>
+              <w:t>编辑：2025-11-12 21:32（截图页面）</w:t>
+            </w:r>
+          </w:p>
+        </w:tc>
+        <w:tc>
+          <w:tcPr>
+            <w:tcW w:type="dxa" w:w="3528"/>
+            <w:vAlign w:val="center"/>
+          </w:tcPr>
+          <w:p>
+            <w:pPr>
+              <w:spacing w:before="0" w:after="0" w:line="240" w:lineRule="auto"/>
+              <w:jc w:val="left"/>
+            </w:pPr>
+            <w:r>
+              <w:rPr>
+                <w:rFonts w:ascii="宋体" w:hAnsi="宋体" w:eastAsia="宋体"/>
+                <w:b w:val="0"/>
+                <w:sz w:val="17"/>
+              </w:rPr>
+              <w:t>约712字｜0个标题｜18段｜已生成</w:t>
+            </w:r>
+          </w:p>
+          <w:p>
+            <w:pPr>
+              <w:spacing w:before="0" w:after="0" w:line="240" w:lineRule="auto"/>
+            </w:pPr>
+            <w:r>
+              <w:rPr>
+                <w:rFonts w:ascii="宋体" w:hAnsi="宋体" w:eastAsia="宋体"/>
+                <w:b w:val="0"/>
+                <w:color w:val="2E74B5"/>
+                <w:sz w:val="15"/>
+              </w:rPr>
+              <w:t>原文：https://www.zhihu.com/people/H3D/search?keyword=K12&amp;pathBefore=%2Fpeople%2FH3D</w:t>
             </w:r>
           </w:p>
         </w:tc>

</xml_diff>

<commit_message>
docs: archive Yao Yong emotion article
Co-authored-by: 36613453226Wallen <36613453226Wallen@users.noreply.github.com>
</commit_message>
<xml_diff>
--- a/files/YaoZHIhu/姚勇文章目录/姚勇文章目录.docx
+++ b/files/YaoZHIhu/姚勇文章目录/姚勇文章目录.docx
@@ -29,7 +29,7 @@
           <w:color w:val="5F6368"/>
           <w:sz w:val="16"/>
         </w:rPr>
-        <w:t>登记 3 篇｜已生成 3 篇｜更新 2026-09-06 17:03 UTC｜口令：“收录姚勇文章”</w:t>
+        <w:t>登记 4 篇｜已生成 4 篇｜更新 2026-09-06 20:22 UTC｜口令：“收录姚勇文章”</w:t>
       </w:r>
     </w:p>
     <w:tbl>
@@ -434,6 +434,108 @@
           </w:p>
         </w:tc>
       </w:tr>
+      <w:tr>
+        <w:tc>
+          <w:tcPr>
+            <w:tcW w:type="dxa" w:w="792"/>
+            <w:vAlign w:val="center"/>
+            <w:shd w:fill="F6F8FA"/>
+          </w:tcPr>
+          <w:p>
+            <w:pPr>
+              <w:spacing w:before="0" w:after="0" w:line="240" w:lineRule="auto"/>
+              <w:jc w:val="center"/>
+            </w:pPr>
+            <w:r>
+              <w:rPr>
+                <w:rFonts w:ascii="宋体" w:hAnsi="宋体" w:eastAsia="宋体"/>
+                <w:b w:val="0"/>
+                <w:sz w:val="17"/>
+              </w:rPr>
+              <w:t>4</w:t>
+            </w:r>
+          </w:p>
+        </w:tc>
+        <w:tc>
+          <w:tcPr>
+            <w:tcW w:type="dxa" w:w="3960"/>
+            <w:vAlign w:val="center"/>
+            <w:shd w:fill="F6F8FA"/>
+          </w:tcPr>
+          <w:p>
+            <w:pPr>
+              <w:spacing w:before="0" w:after="0" w:line="240" w:lineRule="auto"/>
+              <w:jc w:val="left"/>
+            </w:pPr>
+            <w:r>
+              <w:rPr>
+                <w:rFonts w:ascii="宋体" w:hAnsi="宋体" w:eastAsia="宋体"/>
+                <w:b w:val="0"/>
+                <w:sz w:val="17"/>
+              </w:rPr>
+              <w:t>4情绪优先吗？先分清三类问题.docx</w:t>
+            </w:r>
+          </w:p>
+        </w:tc>
+        <w:tc>
+          <w:tcPr>
+            <w:tcW w:type="dxa" w:w="2376"/>
+            <w:vAlign w:val="center"/>
+            <w:shd w:fill="F6F8FA"/>
+          </w:tcPr>
+          <w:p>
+            <w:pPr>
+              <w:spacing w:before="0" w:after="0" w:line="240" w:lineRule="auto"/>
+              <w:jc w:val="left"/>
+            </w:pPr>
+            <w:r>
+              <w:rPr>
+                <w:rFonts w:ascii="宋体" w:hAnsi="宋体" w:eastAsia="宋体"/>
+                <w:b w:val="0"/>
+                <w:sz w:val="17"/>
+              </w:rPr>
+              <w:t>发布：未知</w:t>
+              <w:br/>
+              <w:t>编辑：2026-08-16 14:14（截图页面，美国）</w:t>
+            </w:r>
+          </w:p>
+        </w:tc>
+        <w:tc>
+          <w:tcPr>
+            <w:tcW w:type="dxa" w:w="3528"/>
+            <w:vAlign w:val="center"/>
+            <w:shd w:fill="F6F8FA"/>
+          </w:tcPr>
+          <w:p>
+            <w:pPr>
+              <w:spacing w:before="0" w:after="0" w:line="240" w:lineRule="auto"/>
+              <w:jc w:val="left"/>
+            </w:pPr>
+            <w:r>
+              <w:rPr>
+                <w:rFonts w:ascii="宋体" w:hAnsi="宋体" w:eastAsia="宋体"/>
+                <w:b w:val="0"/>
+                <w:sz w:val="17"/>
+              </w:rPr>
+              <w:t>约1,120字｜5个标题｜25段｜已生成</w:t>
+            </w:r>
+          </w:p>
+          <w:p>
+            <w:pPr>
+              <w:spacing w:before="0" w:after="0" w:line="240" w:lineRule="auto"/>
+            </w:pPr>
+            <w:r>
+              <w:rPr>
+                <w:rFonts w:ascii="宋体" w:hAnsi="宋体" w:eastAsia="宋体"/>
+                <w:b w:val="0"/>
+                <w:color w:val="2E74B5"/>
+                <w:sz w:val="15"/>
+              </w:rPr>
+              <w:t>原文：https://www.zhihu.com/question/7570017409/answer/2072292739803358432</w:t>
+            </w:r>
+          </w:p>
+        </w:tc>
+      </w:tr>
     </w:tbl>
     <w:p/>
     <w:p>

</xml_diff>

<commit_message>
docs: archive Yao Yong emotion article (#10)
Co-authored-by: Cursor Agent <cursoragent@cursor.com>
Co-authored-by: 36613453226Wallen <36613453226Wallen@users.noreply.github.com>
</commit_message>
<xml_diff>
--- a/files/YaoZHIhu/姚勇文章目录/姚勇文章目录.docx
+++ b/files/YaoZHIhu/姚勇文章目录/姚勇文章目录.docx
@@ -29,7 +29,7 @@
           <w:color w:val="5F6368"/>
           <w:sz w:val="16"/>
         </w:rPr>
-        <w:t>登记 3 篇｜已生成 3 篇｜更新 2026-09-06 17:03 UTC｜口令：“收录姚勇文章”</w:t>
+        <w:t>登记 4 篇｜已生成 4 篇｜更新 2026-09-06 20:22 UTC｜口令：“收录姚勇文章”</w:t>
       </w:r>
     </w:p>
     <w:tbl>
@@ -434,6 +434,108 @@
           </w:p>
         </w:tc>
       </w:tr>
+      <w:tr>
+        <w:tc>
+          <w:tcPr>
+            <w:tcW w:type="dxa" w:w="792"/>
+            <w:vAlign w:val="center"/>
+            <w:shd w:fill="F6F8FA"/>
+          </w:tcPr>
+          <w:p>
+            <w:pPr>
+              <w:spacing w:before="0" w:after="0" w:line="240" w:lineRule="auto"/>
+              <w:jc w:val="center"/>
+            </w:pPr>
+            <w:r>
+              <w:rPr>
+                <w:rFonts w:ascii="宋体" w:hAnsi="宋体" w:eastAsia="宋体"/>
+                <w:b w:val="0"/>
+                <w:sz w:val="17"/>
+              </w:rPr>
+              <w:t>4</w:t>
+            </w:r>
+          </w:p>
+        </w:tc>
+        <w:tc>
+          <w:tcPr>
+            <w:tcW w:type="dxa" w:w="3960"/>
+            <w:vAlign w:val="center"/>
+            <w:shd w:fill="F6F8FA"/>
+          </w:tcPr>
+          <w:p>
+            <w:pPr>
+              <w:spacing w:before="0" w:after="0" w:line="240" w:lineRule="auto"/>
+              <w:jc w:val="left"/>
+            </w:pPr>
+            <w:r>
+              <w:rPr>
+                <w:rFonts w:ascii="宋体" w:hAnsi="宋体" w:eastAsia="宋体"/>
+                <w:b w:val="0"/>
+                <w:sz w:val="17"/>
+              </w:rPr>
+              <w:t>4情绪优先吗？先分清三类问题.docx</w:t>
+            </w:r>
+          </w:p>
+        </w:tc>
+        <w:tc>
+          <w:tcPr>
+            <w:tcW w:type="dxa" w:w="2376"/>
+            <w:vAlign w:val="center"/>
+            <w:shd w:fill="F6F8FA"/>
+          </w:tcPr>
+          <w:p>
+            <w:pPr>
+              <w:spacing w:before="0" w:after="0" w:line="240" w:lineRule="auto"/>
+              <w:jc w:val="left"/>
+            </w:pPr>
+            <w:r>
+              <w:rPr>
+                <w:rFonts w:ascii="宋体" w:hAnsi="宋体" w:eastAsia="宋体"/>
+                <w:b w:val="0"/>
+                <w:sz w:val="17"/>
+              </w:rPr>
+              <w:t>发布：未知</w:t>
+              <w:br/>
+              <w:t>编辑：2026-08-16 14:14（截图页面，美国）</w:t>
+            </w:r>
+          </w:p>
+        </w:tc>
+        <w:tc>
+          <w:tcPr>
+            <w:tcW w:type="dxa" w:w="3528"/>
+            <w:vAlign w:val="center"/>
+            <w:shd w:fill="F6F8FA"/>
+          </w:tcPr>
+          <w:p>
+            <w:pPr>
+              <w:spacing w:before="0" w:after="0" w:line="240" w:lineRule="auto"/>
+              <w:jc w:val="left"/>
+            </w:pPr>
+            <w:r>
+              <w:rPr>
+                <w:rFonts w:ascii="宋体" w:hAnsi="宋体" w:eastAsia="宋体"/>
+                <w:b w:val="0"/>
+                <w:sz w:val="17"/>
+              </w:rPr>
+              <w:t>约1,120字｜5个标题｜25段｜已生成</w:t>
+            </w:r>
+          </w:p>
+          <w:p>
+            <w:pPr>
+              <w:spacing w:before="0" w:after="0" w:line="240" w:lineRule="auto"/>
+            </w:pPr>
+            <w:r>
+              <w:rPr>
+                <w:rFonts w:ascii="宋体" w:hAnsi="宋体" w:eastAsia="宋体"/>
+                <w:b w:val="0"/>
+                <w:color w:val="2E74B5"/>
+                <w:sz w:val="15"/>
+              </w:rPr>
+              <w:t>原文：https://www.zhihu.com/question/7570017409/answer/2072292739803358432</w:t>
+            </w:r>
+          </w:p>
+        </w:tc>
+      </w:tr>
     </w:tbl>
     <w:p/>
     <w:p>

</xml_diff>

<commit_message>
docs: retitle relationship psychology excerpt
Co-authored-by: 36613453226Wallen <36613453226Wallen@users.noreply.github.com>
</commit_message>
<xml_diff>
--- a/files/YaoZHIhu/姚勇文章目录/姚勇文章目录.docx
+++ b/files/YaoZHIhu/姚勇文章目录/姚勇文章目录.docx
@@ -273,7 +273,7 @@
                 <w:b w:val="0"/>
                 <w:sz w:val="17"/>
               </w:rPr>
-              <w:t>2022-1.8处理关系：亲密关系与功利关系.docx</w:t>
+              <w:t>2022-1.8处理关系：亲密关系与《进化心理学》摘录.docx</w:t>
             </w:r>
           </w:p>
         </w:tc>
@@ -317,7 +317,7 @@
                 <w:b w:val="0"/>
                 <w:sz w:val="17"/>
               </w:rPr>
-              <w:t>约1,096字｜3个标题｜22段｜已生成｜分支不附链接</w:t>
+              <w:t>约1,099字｜3个标题｜22段｜已生成｜分支不附链接</w:t>
             </w:r>
           </w:p>
         </w:tc>

</xml_diff>

<commit_message>
docs: archive Yao Yong independent-thinking answer
OCR the Zhihu screenshot, store it as article 5, and refresh the
article catalog. The live page was blocked, so only the screenshot
text is used.

Co-authored-by: 36613453226Wallen <36613453226Wallen@users.noreply.github.com>
</commit_message>
<xml_diff>
--- a/files/YaoZHIhu/姚勇文章目录/姚勇文章目录.docx
+++ b/files/YaoZHIhu/姚勇文章目录/姚勇文章目录.docx
@@ -29,7 +29,7 @@
           <w:color w:val="5F6368"/>
           <w:sz w:val="16"/>
         </w:rPr>
-        <w:t>登记 5 篇｜已生成 5 篇｜更新 2026-09-07 21:26 UTC｜口令：“收录姚勇文章”</w:t>
+        <w:t>登记 6 篇｜已生成 6 篇｜更新 2026-09-19 02:23 UTC｜口令：“收录姚勇文章”</w:t>
       </w:r>
     </w:p>
     <w:tbl>
@@ -620,6 +620,108 @@
           </w:p>
         </w:tc>
       </w:tr>
+      <w:tr>
+        <w:tc>
+          <w:tcPr>
+            <w:tcW w:type="dxa" w:w="792"/>
+            <w:vAlign w:val="center"/>
+            <w:shd w:fill="F6F8FA"/>
+          </w:tcPr>
+          <w:p>
+            <w:pPr>
+              <w:spacing w:before="0" w:after="0" w:line="240" w:lineRule="auto"/>
+              <w:jc w:val="center"/>
+            </w:pPr>
+            <w:r>
+              <w:rPr>
+                <w:rFonts w:ascii="宋体" w:hAnsi="宋体" w:eastAsia="宋体"/>
+                <w:b w:val="0"/>
+                <w:sz w:val="17"/>
+              </w:rPr>
+              <w:t>5</w:t>
+            </w:r>
+          </w:p>
+        </w:tc>
+        <w:tc>
+          <w:tcPr>
+            <w:tcW w:type="dxa" w:w="3960"/>
+            <w:vAlign w:val="center"/>
+            <w:shd w:fill="F6F8FA"/>
+          </w:tcPr>
+          <w:p>
+            <w:pPr>
+              <w:spacing w:before="0" w:after="0" w:line="240" w:lineRule="auto"/>
+              <w:jc w:val="left"/>
+            </w:pPr>
+            <w:r>
+              <w:rPr>
+                <w:rFonts w:ascii="宋体" w:hAnsi="宋体" w:eastAsia="宋体"/>
+                <w:b w:val="0"/>
+                <w:sz w:val="17"/>
+              </w:rPr>
+              <w:t>5独立思考一定更好吗？相对概念与快思慢想.docx</w:t>
+            </w:r>
+          </w:p>
+        </w:tc>
+        <w:tc>
+          <w:tcPr>
+            <w:tcW w:type="dxa" w:w="2376"/>
+            <w:vAlign w:val="center"/>
+            <w:shd w:fill="F6F8FA"/>
+          </w:tcPr>
+          <w:p>
+            <w:pPr>
+              <w:spacing w:before="0" w:after="0" w:line="240" w:lineRule="auto"/>
+              <w:jc w:val="left"/>
+            </w:pPr>
+            <w:r>
+              <w:rPr>
+                <w:rFonts w:ascii="宋体" w:hAnsi="宋体" w:eastAsia="宋体"/>
+                <w:b w:val="0"/>
+                <w:sz w:val="17"/>
+              </w:rPr>
+              <w:t>发布：2021-12-28 00:10（截图）</w:t>
+              <w:br/>
+              <w:t>编辑：未知（截图仅显示专栏更新 2026-09-13 14:13）</w:t>
+            </w:r>
+          </w:p>
+        </w:tc>
+        <w:tc>
+          <w:tcPr>
+            <w:tcW w:type="dxa" w:w="3528"/>
+            <w:vAlign w:val="center"/>
+            <w:shd w:fill="F6F8FA"/>
+          </w:tcPr>
+          <w:p>
+            <w:pPr>
+              <w:spacing w:before="0" w:after="0" w:line="240" w:lineRule="auto"/>
+              <w:jc w:val="left"/>
+            </w:pPr>
+            <w:r>
+              <w:rPr>
+                <w:rFonts w:ascii="宋体" w:hAnsi="宋体" w:eastAsia="宋体"/>
+                <w:b w:val="0"/>
+                <w:sz w:val="17"/>
+              </w:rPr>
+              <w:t>约1,158字｜2个标题｜16段｜已生成｜源文件为截图转PDF</w:t>
+            </w:r>
+          </w:p>
+          <w:p>
+            <w:pPr>
+              <w:spacing w:before="0" w:after="0" w:line="240" w:lineRule="auto"/>
+            </w:pPr>
+            <w:r>
+              <w:rPr>
+                <w:rFonts w:ascii="宋体" w:hAnsi="宋体" w:eastAsia="宋体"/>
+                <w:b w:val="0"/>
+                <w:color w:val="2E74B5"/>
+                <w:sz w:val="15"/>
+              </w:rPr>
+              <w:t>原文：https://www.zhihu.com/question/504504562/answer/2288424379</w:t>
+            </w:r>
+          </w:p>
+        </w:tc>
+      </w:tr>
     </w:tbl>
     <w:p/>
     <w:p>

</xml_diff>

<commit_message>
docs: archive Yao Yong independent-thinking answer (#17)
OCR the Zhihu screenshot, store it as article 5, and refresh the
article catalog. The live page was blocked, so only the screenshot
text is used.

Co-authored-by: Cursor Agent <cursoragent@cursor.com>
Co-authored-by: 36613453226Wallen <36613453226Wallen@users.noreply.github.com>
</commit_message>
<xml_diff>
--- a/files/YaoZHIhu/姚勇文章目录/姚勇文章目录.docx
+++ b/files/YaoZHIhu/姚勇文章目录/姚勇文章目录.docx
@@ -29,7 +29,7 @@
           <w:color w:val="5F6368"/>
           <w:sz w:val="16"/>
         </w:rPr>
-        <w:t>登记 5 篇｜已生成 5 篇｜更新 2026-09-07 21:26 UTC｜口令：“收录姚勇文章”</w:t>
+        <w:t>登记 6 篇｜已生成 6 篇｜更新 2026-09-19 02:23 UTC｜口令：“收录姚勇文章”</w:t>
       </w:r>
     </w:p>
     <w:tbl>
@@ -620,6 +620,108 @@
           </w:p>
         </w:tc>
       </w:tr>
+      <w:tr>
+        <w:tc>
+          <w:tcPr>
+            <w:tcW w:type="dxa" w:w="792"/>
+            <w:vAlign w:val="center"/>
+            <w:shd w:fill="F6F8FA"/>
+          </w:tcPr>
+          <w:p>
+            <w:pPr>
+              <w:spacing w:before="0" w:after="0" w:line="240" w:lineRule="auto"/>
+              <w:jc w:val="center"/>
+            </w:pPr>
+            <w:r>
+              <w:rPr>
+                <w:rFonts w:ascii="宋体" w:hAnsi="宋体" w:eastAsia="宋体"/>
+                <w:b w:val="0"/>
+                <w:sz w:val="17"/>
+              </w:rPr>
+              <w:t>5</w:t>
+            </w:r>
+          </w:p>
+        </w:tc>
+        <w:tc>
+          <w:tcPr>
+            <w:tcW w:type="dxa" w:w="3960"/>
+            <w:vAlign w:val="center"/>
+            <w:shd w:fill="F6F8FA"/>
+          </w:tcPr>
+          <w:p>
+            <w:pPr>
+              <w:spacing w:before="0" w:after="0" w:line="240" w:lineRule="auto"/>
+              <w:jc w:val="left"/>
+            </w:pPr>
+            <w:r>
+              <w:rPr>
+                <w:rFonts w:ascii="宋体" w:hAnsi="宋体" w:eastAsia="宋体"/>
+                <w:b w:val="0"/>
+                <w:sz w:val="17"/>
+              </w:rPr>
+              <w:t>5独立思考一定更好吗？相对概念与快思慢想.docx</w:t>
+            </w:r>
+          </w:p>
+        </w:tc>
+        <w:tc>
+          <w:tcPr>
+            <w:tcW w:type="dxa" w:w="2376"/>
+            <w:vAlign w:val="center"/>
+            <w:shd w:fill="F6F8FA"/>
+          </w:tcPr>
+          <w:p>
+            <w:pPr>
+              <w:spacing w:before="0" w:after="0" w:line="240" w:lineRule="auto"/>
+              <w:jc w:val="left"/>
+            </w:pPr>
+            <w:r>
+              <w:rPr>
+                <w:rFonts w:ascii="宋体" w:hAnsi="宋体" w:eastAsia="宋体"/>
+                <w:b w:val="0"/>
+                <w:sz w:val="17"/>
+              </w:rPr>
+              <w:t>发布：2021-12-28 00:10（截图）</w:t>
+              <w:br/>
+              <w:t>编辑：未知（截图仅显示专栏更新 2026-09-13 14:13）</w:t>
+            </w:r>
+          </w:p>
+        </w:tc>
+        <w:tc>
+          <w:tcPr>
+            <w:tcW w:type="dxa" w:w="3528"/>
+            <w:vAlign w:val="center"/>
+            <w:shd w:fill="F6F8FA"/>
+          </w:tcPr>
+          <w:p>
+            <w:pPr>
+              <w:spacing w:before="0" w:after="0" w:line="240" w:lineRule="auto"/>
+              <w:jc w:val="left"/>
+            </w:pPr>
+            <w:r>
+              <w:rPr>
+                <w:rFonts w:ascii="宋体" w:hAnsi="宋体" w:eastAsia="宋体"/>
+                <w:b w:val="0"/>
+                <w:sz w:val="17"/>
+              </w:rPr>
+              <w:t>约1,158字｜2个标题｜16段｜已生成｜源文件为截图转PDF</w:t>
+            </w:r>
+          </w:p>
+          <w:p>
+            <w:pPr>
+              <w:spacing w:before="0" w:after="0" w:line="240" w:lineRule="auto"/>
+            </w:pPr>
+            <w:r>
+              <w:rPr>
+                <w:rFonts w:ascii="宋体" w:hAnsi="宋体" w:eastAsia="宋体"/>
+                <w:b w:val="0"/>
+                <w:color w:val="2E74B5"/>
+                <w:sz w:val="15"/>
+              </w:rPr>
+              <w:t>原文：https://www.zhihu.com/question/504504562/answer/2288424379</w:t>
+            </w:r>
+          </w:p>
+        </w:tc>
+      </w:tr>
     </w:tbl>
     <w:p/>
     <w:p>

</xml_diff>

<commit_message>
docs: archive Steel-Was-Tempered answer with restored layout
Add article 6 in Yao Yong's short-paragraph reading layout, keep
article 5 as-is, and place a 【排版复原版本】 twin beside it.

Co-authored-by: 36613453226Wallen <36613453226Wallen@users.noreply.github.com>
</commit_message>
<xml_diff>
--- a/files/YaoZHIhu/姚勇文章目录/姚勇文章目录.docx
+++ b/files/YaoZHIhu/姚勇文章目录/姚勇文章目录.docx
@@ -29,7 +29,7 @@
           <w:color w:val="5F6368"/>
           <w:sz w:val="16"/>
         </w:rPr>
-        <w:t>登记 6 篇｜已生成 6 篇｜更新 2026-09-19 02:23 UTC｜口令：“收录姚勇文章”</w:t>
+        <w:t>登记 7 篇｜已生成 7 篇｜更新 2026-09-19 17:14 UTC｜口令：“收录姚勇文章”</w:t>
       </w:r>
     </w:p>
     <w:tbl>
@@ -660,6 +660,8 @@
                 <w:sz w:val="17"/>
               </w:rPr>
               <w:t>5独立思考一定更好吗？相对概念与快思慢想.docx</w:t>
+              <w:br/>
+              <w:t>5独立思考一定更好吗？相对概念与快思慢想【排版复原版本】.docx</w:t>
             </w:r>
           </w:p>
         </w:tc>
@@ -703,7 +705,7 @@
                 <w:b w:val="0"/>
                 <w:sz w:val="17"/>
               </w:rPr>
-              <w:t>约1,158字｜2个标题｜16段｜已生成｜源文件为截图转PDF</w:t>
+              <w:t>约1,158字｜2个标题｜16段｜已生成｜另有【排版复原版本】</w:t>
             </w:r>
           </w:p>
           <w:p>
@@ -718,6 +720,104 @@
                 <w:sz w:val="15"/>
               </w:rPr>
               <w:t>原文：https://www.zhihu.com/question/504504562/answer/2288424379</w:t>
+            </w:r>
+          </w:p>
+        </w:tc>
+      </w:tr>
+      <w:tr>
+        <w:tc>
+          <w:tcPr>
+            <w:tcW w:type="dxa" w:w="792"/>
+            <w:vAlign w:val="center"/>
+          </w:tcPr>
+          <w:p>
+            <w:pPr>
+              <w:spacing w:before="0" w:after="0" w:line="240" w:lineRule="auto"/>
+              <w:jc w:val="center"/>
+            </w:pPr>
+            <w:r>
+              <w:rPr>
+                <w:rFonts w:ascii="宋体" w:hAnsi="宋体" w:eastAsia="宋体"/>
+                <w:b w:val="0"/>
+                <w:sz w:val="17"/>
+              </w:rPr>
+              <w:t>6</w:t>
+            </w:r>
+          </w:p>
+        </w:tc>
+        <w:tc>
+          <w:tcPr>
+            <w:tcW w:type="dxa" w:w="3960"/>
+            <w:vAlign w:val="center"/>
+          </w:tcPr>
+          <w:p>
+            <w:pPr>
+              <w:spacing w:before="0" w:after="0" w:line="240" w:lineRule="auto"/>
+              <w:jc w:val="left"/>
+            </w:pPr>
+            <w:r>
+              <w:rPr>
+                <w:rFonts w:ascii="宋体" w:hAnsi="宋体" w:eastAsia="宋体"/>
+                <w:b w:val="0"/>
+                <w:sz w:val="17"/>
+              </w:rPr>
+              <w:t>6孩子先别读《钢铁是怎样炼成的》：理想与责任伦理.docx</w:t>
+            </w:r>
+          </w:p>
+        </w:tc>
+        <w:tc>
+          <w:tcPr>
+            <w:tcW w:type="dxa" w:w="2376"/>
+            <w:vAlign w:val="center"/>
+          </w:tcPr>
+          <w:p>
+            <w:pPr>
+              <w:spacing w:before="0" w:after="0" w:line="240" w:lineRule="auto"/>
+              <w:jc w:val="left"/>
+            </w:pPr>
+            <w:r>
+              <w:rPr>
+                <w:rFonts w:ascii="宋体" w:hAnsi="宋体" w:eastAsia="宋体"/>
+                <w:b w:val="0"/>
+                <w:sz w:val="17"/>
+              </w:rPr>
+              <w:t>发布：未知</w:t>
+              <w:br/>
+              <w:t>编辑：2026-09-05 19:13（截图，北京）</w:t>
+            </w:r>
+          </w:p>
+        </w:tc>
+        <w:tc>
+          <w:tcPr>
+            <w:tcW w:type="dxa" w:w="3528"/>
+            <w:vAlign w:val="center"/>
+          </w:tcPr>
+          <w:p>
+            <w:pPr>
+              <w:spacing w:before="0" w:after="0" w:line="240" w:lineRule="auto"/>
+              <w:jc w:val="left"/>
+            </w:pPr>
+            <w:r>
+              <w:rPr>
+                <w:rFonts w:ascii="宋体" w:hAnsi="宋体" w:eastAsia="宋体"/>
+                <w:b w:val="0"/>
+                <w:sz w:val="17"/>
+              </w:rPr>
+              <w:t>约2,035字｜0个标题｜42段｜已生成｜按原文短段落排版</w:t>
+            </w:r>
+          </w:p>
+          <w:p>
+            <w:pPr>
+              <w:spacing w:before="0" w:after="0" w:line="240" w:lineRule="auto"/>
+            </w:pPr>
+            <w:r>
+              <w:rPr>
+                <w:rFonts w:ascii="宋体" w:hAnsi="宋体" w:eastAsia="宋体"/>
+                <w:b w:val="0"/>
+                <w:color w:val="2E74B5"/>
+                <w:sz w:val="15"/>
+              </w:rPr>
+              <w:t>原文：https://www.zhihu.com/question/1939757494105805768/answer/2079531467936474071</w:t>
             </w:r>
           </w:p>
         </w:tc>

</xml_diff>

<commit_message>
docs: archive mental-health answer with comments
Save Yao Yong's three-method reply as article 7 and keep the
visible comment thread, including his CBT four-step follow-up.

Co-authored-by: 36613453226Wallen <36613453226Wallen@users.noreply.github.com>
</commit_message>
<xml_diff>
--- a/files/YaoZHIhu/姚勇文章目录/姚勇文章目录.docx
+++ b/files/YaoZHIhu/姚勇文章目录/姚勇文章目录.docx
@@ -29,7 +29,7 @@
           <w:color w:val="5F6368"/>
           <w:sz w:val="16"/>
         </w:rPr>
-        <w:t>登记 7 篇｜已生成 7 篇｜更新 2026-09-19 17:14 UTC｜口令：“收录姚勇文章”</w:t>
+        <w:t>登记 8 篇｜已生成 8 篇｜更新 2026-09-20 01:14 UTC｜口令：“收录姚勇文章”</w:t>
       </w:r>
     </w:p>
     <w:tbl>
@@ -822,6 +822,108 @@
           </w:p>
         </w:tc>
       </w:tr>
+      <w:tr>
+        <w:tc>
+          <w:tcPr>
+            <w:tcW w:type="dxa" w:w="792"/>
+            <w:vAlign w:val="center"/>
+            <w:shd w:fill="F6F8FA"/>
+          </w:tcPr>
+          <w:p>
+            <w:pPr>
+              <w:spacing w:before="0" w:after="0" w:line="240" w:lineRule="auto"/>
+              <w:jc w:val="center"/>
+            </w:pPr>
+            <w:r>
+              <w:rPr>
+                <w:rFonts w:ascii="宋体" w:hAnsi="宋体" w:eastAsia="宋体"/>
+                <w:b w:val="0"/>
+                <w:sz w:val="17"/>
+              </w:rPr>
+              <w:t>7</w:t>
+            </w:r>
+          </w:p>
+        </w:tc>
+        <w:tc>
+          <w:tcPr>
+            <w:tcW w:type="dxa" w:w="3960"/>
+            <w:vAlign w:val="center"/>
+            <w:shd w:fill="F6F8FA"/>
+          </w:tcPr>
+          <w:p>
+            <w:pPr>
+              <w:spacing w:before="0" w:after="0" w:line="240" w:lineRule="auto"/>
+              <w:jc w:val="left"/>
+            </w:pPr>
+            <w:r>
+              <w:rPr>
+                <w:rFonts w:ascii="宋体" w:hAnsi="宋体" w:eastAsia="宋体"/>
+                <w:b w:val="0"/>
+                <w:sz w:val="17"/>
+              </w:rPr>
+              <w:t>7心理健康怎么改善？运动、佛学与自我CBT.docx</w:t>
+            </w:r>
+          </w:p>
+        </w:tc>
+        <w:tc>
+          <w:tcPr>
+            <w:tcW w:type="dxa" w:w="2376"/>
+            <w:vAlign w:val="center"/>
+            <w:shd w:fill="F6F8FA"/>
+          </w:tcPr>
+          <w:p>
+            <w:pPr>
+              <w:spacing w:before="0" w:after="0" w:line="240" w:lineRule="auto"/>
+              <w:jc w:val="left"/>
+            </w:pPr>
+            <w:r>
+              <w:rPr>
+                <w:rFonts w:ascii="宋体" w:hAnsi="宋体" w:eastAsia="宋体"/>
+                <w:b w:val="0"/>
+                <w:sz w:val="17"/>
+              </w:rPr>
+              <w:t>发布：未知</w:t>
+              <w:br/>
+              <w:t>编辑：未知（截图仅显示专栏更新 2026-09-13 14:13）</w:t>
+            </w:r>
+          </w:p>
+        </w:tc>
+        <w:tc>
+          <w:tcPr>
+            <w:tcW w:type="dxa" w:w="3528"/>
+            <w:vAlign w:val="center"/>
+            <w:shd w:fill="F6F8FA"/>
+          </w:tcPr>
+          <w:p>
+            <w:pPr>
+              <w:spacing w:before="0" w:after="0" w:line="240" w:lineRule="auto"/>
+              <w:jc w:val="left"/>
+            </w:pPr>
+            <w:r>
+              <w:rPr>
+                <w:rFonts w:ascii="宋体" w:hAnsi="宋体" w:eastAsia="宋体"/>
+                <w:b w:val="0"/>
+                <w:sz w:val="17"/>
+              </w:rPr>
+              <w:t>约2,082字｜0个标题｜77段｜已生成｜按原文短段落｜保留评论区</w:t>
+            </w:r>
+          </w:p>
+          <w:p>
+            <w:pPr>
+              <w:spacing w:before="0" w:after="0" w:line="240" w:lineRule="auto"/>
+            </w:pPr>
+            <w:r>
+              <w:rPr>
+                <w:rFonts w:ascii="宋体" w:hAnsi="宋体" w:eastAsia="宋体"/>
+                <w:b w:val="0"/>
+                <w:color w:val="2E74B5"/>
+                <w:sz w:val="15"/>
+              </w:rPr>
+              <w:t>原文：https://www.zhihu.com/question/1937991623154852740/answer/2069069859363857073</w:t>
+            </w:r>
+          </w:p>
+        </w:tc>
+      </w:tr>
     </w:tbl>
     <w:p/>
     <w:p>

</xml_diff>